<commit_message>
Add expected progression and pts to for bonuses to game worksheets
</commit_message>
<xml_diff>
--- a/CourseMaterials/01_scratch/00_deterministic_maze/make_a_maze.docx
+++ b/CourseMaterials/01_scratch/00_deterministic_maze/make_a_maze.docx
@@ -1,6 +1,6 @@
 
 <file path=word/document.xml><?xml version="1.0" encoding="utf-8"?>
-<w:document xmlns:wpc="http://schemas.microsoft.com/office/word/2010/wordprocessingCanvas" xmlns:cx="http://schemas.microsoft.com/office/drawing/2014/chartex" xmlns:cx1="http://schemas.microsoft.com/office/drawing/2015/9/8/chartex" xmlns:cx2="http://schemas.microsoft.com/office/drawing/2015/10/21/chartex" xmlns:cx3="http://schemas.microsoft.com/office/drawing/2016/5/9/chartex" xmlns:cx4="http://schemas.microsoft.com/office/drawing/2016/5/10/chartex" xmlns:cx5="http://schemas.microsoft.com/office/drawing/2016/5/11/chartex" xmlns:cx6="http://schemas.microsoft.com/office/drawing/2016/5/12/chartex" xmlns:cx7="http://schemas.microsoft.com/office/drawing/2016/5/13/chartex" xmlns:cx8="http://schemas.microsoft.com/office/drawing/2016/5/14/chartex" xmlns:mc="http://schemas.openxmlformats.org/markup-compatibility/2006" xmlns:aink="http://schemas.microsoft.com/office/drawing/2016/ink" xmlns:am3d="http://schemas.microsoft.com/office/drawing/2017/model3d" xmlns:o="urn:schemas-microsoft-com:office:office" xmlns:oel="http://schemas.microsoft.com/office/2019/extlst" xmlns:r="http://schemas.openxmlformats.org/officeDocument/2006/relationships" xmlns:m="http://schemas.openxmlformats.org/officeDocument/2006/math" xmlns:v="urn:schemas-microsoft-com:vml" xmlns:wp14="http://schemas.microsoft.com/office/word/2010/wordprocessingDrawing" xmlns:wp="http://schemas.openxmlformats.org/drawingml/2006/wordprocessingDrawing" xmlns:w10="urn:schemas-microsoft-com:office:word" xmlns:w="http://schemas.openxmlformats.org/wordprocessingml/2006/main" xmlns:w14="http://schemas.microsoft.com/office/word/2010/wordml" xmlns:w15="http://schemas.microsoft.com/office/word/2012/wordml" xmlns:w16cex="http://schemas.microsoft.com/office/word/2018/wordml/cex" xmlns:w16cid="http://schemas.microsoft.com/office/word/2016/wordml/cid" xmlns:w16="http://schemas.microsoft.com/office/word/2018/wordml" xmlns:w16sdtdh="http://schemas.microsoft.com/office/word/2020/wordml/sdtdatahash" xmlns:w16se="http://schemas.microsoft.com/office/word/2015/wordml/symex" xmlns:wpg="http://schemas.microsoft.com/office/word/2010/wordprocessingGroup" xmlns:wpi="http://schemas.microsoft.com/office/word/2010/wordprocessingInk" xmlns:wne="http://schemas.microsoft.com/office/word/2006/wordml" xmlns:wps="http://schemas.microsoft.com/office/word/2010/wordprocessingShape" mc:Ignorable="w14 w15 w16se w16cid w16 w16cex w16sdtdh wp14">
+<w:document xmlns:wpc="http://schemas.microsoft.com/office/word/2010/wordprocessingCanvas" xmlns:cx="http://schemas.microsoft.com/office/drawing/2014/chartex" xmlns:cx1="http://schemas.microsoft.com/office/drawing/2015/9/8/chartex" xmlns:cx2="http://schemas.microsoft.com/office/drawing/2015/10/21/chartex" xmlns:cx3="http://schemas.microsoft.com/office/drawing/2016/5/9/chartex" xmlns:cx4="http://schemas.microsoft.com/office/drawing/2016/5/10/chartex" xmlns:cx5="http://schemas.microsoft.com/office/drawing/2016/5/11/chartex" xmlns:cx6="http://schemas.microsoft.com/office/drawing/2016/5/12/chartex" xmlns:cx7="http://schemas.microsoft.com/office/drawing/2016/5/13/chartex" xmlns:cx8="http://schemas.microsoft.com/office/drawing/2016/5/14/chartex" xmlns:mc="http://schemas.openxmlformats.org/markup-compatibility/2006" xmlns:aink="http://schemas.microsoft.com/office/drawing/2016/ink" xmlns:am3d="http://schemas.microsoft.com/office/drawing/2017/model3d" xmlns:o="urn:schemas-microsoft-com:office:office" xmlns:oel="http://schemas.microsoft.com/office/2019/extlst" xmlns:r="http://schemas.openxmlformats.org/officeDocument/2006/relationships" xmlns:m="http://schemas.openxmlformats.org/officeDocument/2006/math" xmlns:v="urn:schemas-microsoft-com:vml" xmlns:wp14="http://schemas.microsoft.com/office/word/2010/wordprocessingDrawing" xmlns:wp="http://schemas.openxmlformats.org/drawingml/2006/wordprocessingDrawing" xmlns:w10="urn:schemas-microsoft-com:office:word" xmlns:w="http://schemas.openxmlformats.org/wordprocessingml/2006/main" xmlns:w14="http://schemas.microsoft.com/office/word/2010/wordml" xmlns:w15="http://schemas.microsoft.com/office/word/2012/wordml" xmlns:w16cex="http://schemas.microsoft.com/office/word/2018/wordml/cex" xmlns:w16cid="http://schemas.microsoft.com/office/word/2016/wordml/cid" xmlns:w16="http://schemas.microsoft.com/office/word/2018/wordml" xmlns:w16du="http://schemas.microsoft.com/office/word/2023/wordml/word16du" xmlns:w16sdtdh="http://schemas.microsoft.com/office/word/2020/wordml/sdtdatahash" xmlns:w16sdtfl="http://schemas.microsoft.com/office/word/2024/wordml/sdtformatlock" xmlns:w16se="http://schemas.microsoft.com/office/word/2015/wordml/symex" xmlns:wpg="http://schemas.microsoft.com/office/word/2010/wordprocessingGroup" xmlns:wpi="http://schemas.microsoft.com/office/word/2010/wordprocessingInk" xmlns:wne="http://schemas.microsoft.com/office/word/2006/wordml" xmlns:wps="http://schemas.microsoft.com/office/word/2010/wordprocessingShape" mc:Ignorable="w14 w15 w16se w16cid w16 w16cex w16sdtdh w16sdtfl w16du wp14">
   <w:body>
     <w:p>
       <w:pPr>
@@ -103,8 +103,227 @@
       <w:pPr>
         <w:rPr>
           <w:rFonts w:ascii="Garamond" w:hAnsi="Garamond"/>
+        </w:rPr>
+      </w:pPr>
+      <w:r>
+        <w:rPr>
+          <w:rFonts w:ascii="Garamond" w:hAnsi="Garamond"/>
+          <w:noProof/>
+        </w:rPr>
+        <w:drawing>
+          <wp:anchor distT="0" distB="0" distL="114300" distR="114300" simplePos="0" relativeHeight="251661312" behindDoc="0" locked="0" layoutInCell="1" allowOverlap="1" wp14:anchorId="37364C4E" wp14:editId="4D460F75">
+            <wp:simplePos x="0" y="0"/>
+            <wp:positionH relativeFrom="column">
+              <wp:posOffset>3943350</wp:posOffset>
+            </wp:positionH>
+            <wp:positionV relativeFrom="paragraph">
+              <wp:posOffset>171451</wp:posOffset>
+            </wp:positionV>
+            <wp:extent cx="1094014" cy="432320"/>
+            <wp:effectExtent l="0" t="0" r="0" b="0"/>
+            <wp:wrapNone/>
+            <wp:docPr id="252069997" name="Picture 4" descr="A blue rectangle with white text and a white circle with black numbers&#10;&#10;AI-generated content may be incorrect."/>
+            <wp:cNvGraphicFramePr>
+              <a:graphicFrameLocks xmlns:a="http://schemas.openxmlformats.org/drawingml/2006/main" noChangeAspect="1"/>
+            </wp:cNvGraphicFramePr>
+            <a:graphic xmlns:a="http://schemas.openxmlformats.org/drawingml/2006/main">
+              <a:graphicData uri="http://schemas.openxmlformats.org/drawingml/2006/picture">
+                <pic:pic xmlns:pic="http://schemas.openxmlformats.org/drawingml/2006/picture">
+                  <pic:nvPicPr>
+                    <pic:cNvPr id="252069997" name="Picture 4" descr="A blue rectangle with white text and a white circle with black numbers&#10;&#10;AI-generated content may be incorrect."/>
+                    <pic:cNvPicPr/>
+                  </pic:nvPicPr>
+                  <pic:blipFill>
+                    <a:blip r:embed="rId5" cstate="print">
+                      <a:extLst>
+                        <a:ext uri="{28A0092B-C50C-407E-A947-70E740481C1C}">
+                          <a14:useLocalDpi xmlns:a14="http://schemas.microsoft.com/office/drawing/2010/main" val="0"/>
+                        </a:ext>
+                      </a:extLst>
+                    </a:blip>
+                    <a:stretch>
+                      <a:fillRect/>
+                    </a:stretch>
+                  </pic:blipFill>
+                  <pic:spPr>
+                    <a:xfrm>
+                      <a:off x="0" y="0"/>
+                      <a:ext cx="1109530" cy="438451"/>
+                    </a:xfrm>
+                    <a:prstGeom prst="rect">
+                      <a:avLst/>
+                    </a:prstGeom>
+                  </pic:spPr>
+                </pic:pic>
+              </a:graphicData>
+            </a:graphic>
+            <wp14:sizeRelH relativeFrom="page">
+              <wp14:pctWidth>0</wp14:pctWidth>
+            </wp14:sizeRelH>
+            <wp14:sizeRelV relativeFrom="page">
+              <wp14:pctHeight>0</wp14:pctHeight>
+            </wp14:sizeRelV>
+          </wp:anchor>
+        </w:drawing>
+      </w:r>
+      <w:r>
+        <w:rPr>
+          <w:rFonts w:ascii="Garamond" w:hAnsi="Garamond"/>
+          <w:noProof/>
           <w:color w:val="000000"/>
         </w:rPr>
+        <w:drawing>
+          <wp:anchor distT="0" distB="0" distL="114300" distR="114300" simplePos="0" relativeHeight="251659264" behindDoc="0" locked="0" layoutInCell="1" allowOverlap="1" wp14:anchorId="50853C38" wp14:editId="48662F11">
+            <wp:simplePos x="0" y="0"/>
+            <wp:positionH relativeFrom="column">
+              <wp:posOffset>2457450</wp:posOffset>
+            </wp:positionH>
+            <wp:positionV relativeFrom="paragraph">
+              <wp:posOffset>171450</wp:posOffset>
+            </wp:positionV>
+            <wp:extent cx="898071" cy="393332"/>
+            <wp:effectExtent l="0" t="0" r="3810" b="635"/>
+            <wp:wrapNone/>
+            <wp:docPr id="2073061839" name="Picture 1" descr="A blue and white rectangular sign with white text&#10;&#10;Description automatically generated"/>
+            <wp:cNvGraphicFramePr>
+              <a:graphicFrameLocks xmlns:a="http://schemas.openxmlformats.org/drawingml/2006/main" noChangeAspect="1"/>
+            </wp:cNvGraphicFramePr>
+            <a:graphic xmlns:a="http://schemas.openxmlformats.org/drawingml/2006/main">
+              <a:graphicData uri="http://schemas.openxmlformats.org/drawingml/2006/picture">
+                <pic:pic xmlns:pic="http://schemas.openxmlformats.org/drawingml/2006/picture">
+                  <pic:nvPicPr>
+                    <pic:cNvPr id="2073061839" name="Picture 1" descr="A blue and white rectangular sign with white text&#10;&#10;Description automatically generated"/>
+                    <pic:cNvPicPr/>
+                  </pic:nvPicPr>
+                  <pic:blipFill>
+                    <a:blip r:embed="rId6" cstate="print">
+                      <a:extLst>
+                        <a:ext uri="{28A0092B-C50C-407E-A947-70E740481C1C}">
+                          <a14:useLocalDpi xmlns:a14="http://schemas.microsoft.com/office/drawing/2010/main" val="0"/>
+                        </a:ext>
+                      </a:extLst>
+                    </a:blip>
+                    <a:stretch>
+                      <a:fillRect/>
+                    </a:stretch>
+                  </pic:blipFill>
+                  <pic:spPr>
+                    <a:xfrm>
+                      <a:off x="0" y="0"/>
+                      <a:ext cx="903118" cy="395543"/>
+                    </a:xfrm>
+                    <a:prstGeom prst="rect">
+                      <a:avLst/>
+                    </a:prstGeom>
+                  </pic:spPr>
+                </pic:pic>
+              </a:graphicData>
+            </a:graphic>
+            <wp14:sizeRelH relativeFrom="page">
+              <wp14:pctWidth>0</wp14:pctWidth>
+            </wp14:sizeRelH>
+            <wp14:sizeRelV relativeFrom="page">
+              <wp14:pctHeight>0</wp14:pctHeight>
+            </wp14:sizeRelV>
+          </wp:anchor>
+        </w:drawing>
+      </w:r>
+      <w:r>
+        <w:rPr>
+          <w:rFonts w:ascii="Garamond" w:hAnsi="Garamond"/>
+          <w:noProof/>
+        </w:rPr>
+        <w:drawing>
+          <wp:anchor distT="0" distB="0" distL="114300" distR="114300" simplePos="0" relativeHeight="251660288" behindDoc="0" locked="0" layoutInCell="1" allowOverlap="1" wp14:anchorId="15E816F9" wp14:editId="669DA23F">
+            <wp:simplePos x="0" y="0"/>
+            <wp:positionH relativeFrom="column">
+              <wp:posOffset>702130</wp:posOffset>
+            </wp:positionH>
+            <wp:positionV relativeFrom="paragraph">
+              <wp:posOffset>24493</wp:posOffset>
+            </wp:positionV>
+            <wp:extent cx="1045028" cy="591981"/>
+            <wp:effectExtent l="0" t="0" r="0" b="5080"/>
+            <wp:wrapNone/>
+            <wp:docPr id="1441366120" name="Picture 3" descr="A yellow object with white text and a flag&#10;&#10;AI-generated content may be incorrect."/>
+            <wp:cNvGraphicFramePr>
+              <a:graphicFrameLocks xmlns:a="http://schemas.openxmlformats.org/drawingml/2006/main" noChangeAspect="1"/>
+            </wp:cNvGraphicFramePr>
+            <a:graphic xmlns:a="http://schemas.openxmlformats.org/drawingml/2006/main">
+              <a:graphicData uri="http://schemas.openxmlformats.org/drawingml/2006/picture">
+                <pic:pic xmlns:pic="http://schemas.openxmlformats.org/drawingml/2006/picture">
+                  <pic:nvPicPr>
+                    <pic:cNvPr id="1441366120" name="Picture 3" descr="A yellow object with white text and a flag&#10;&#10;AI-generated content may be incorrect."/>
+                    <pic:cNvPicPr/>
+                  </pic:nvPicPr>
+                  <pic:blipFill>
+                    <a:blip r:embed="rId7" cstate="print">
+                      <a:extLst>
+                        <a:ext uri="{28A0092B-C50C-407E-A947-70E740481C1C}">
+                          <a14:useLocalDpi xmlns:a14="http://schemas.microsoft.com/office/drawing/2010/main" val="0"/>
+                        </a:ext>
+                      </a:extLst>
+                    </a:blip>
+                    <a:stretch>
+                      <a:fillRect/>
+                    </a:stretch>
+                  </pic:blipFill>
+                  <pic:spPr>
+                    <a:xfrm>
+                      <a:off x="0" y="0"/>
+                      <a:ext cx="1053741" cy="596917"/>
+                    </a:xfrm>
+                    <a:prstGeom prst="rect">
+                      <a:avLst/>
+                    </a:prstGeom>
+                  </pic:spPr>
+                </pic:pic>
+              </a:graphicData>
+            </a:graphic>
+            <wp14:sizeRelH relativeFrom="page">
+              <wp14:pctWidth>0</wp14:pctWidth>
+            </wp14:sizeRelH>
+            <wp14:sizeRelV relativeFrom="page">
+              <wp14:pctHeight>0</wp14:pctHeight>
+            </wp14:sizeRelV>
+          </wp:anchor>
+        </w:drawing>
+      </w:r>
+    </w:p>
+    <w:p>
+      <w:pPr>
+        <w:rPr>
+          <w:rFonts w:ascii="Garamond" w:hAnsi="Garamond"/>
+        </w:rPr>
+      </w:pPr>
+    </w:p>
+    <w:p>
+      <w:pPr>
+        <w:rPr>
+          <w:rFonts w:ascii="Garamond" w:hAnsi="Garamond"/>
+        </w:rPr>
+      </w:pPr>
+    </w:p>
+    <w:p>
+      <w:pPr>
+        <w:rPr>
+          <w:rFonts w:ascii="Garamond" w:hAnsi="Garamond"/>
+        </w:rPr>
+      </w:pPr>
+    </w:p>
+    <w:p>
+      <w:pPr>
+        <w:rPr>
+          <w:rFonts w:ascii="Garamond" w:hAnsi="Garamond"/>
+        </w:rPr>
+      </w:pPr>
+    </w:p>
+    <w:p>
+      <w:pPr>
+        <w:rPr>
+          <w:rFonts w:ascii="Garamond" w:hAnsi="Garamond"/>
+          <w:color w:val="000000"/>
+        </w:rPr>
       </w:pPr>
       <w:r>
         <w:rPr>
@@ -117,7 +336,14 @@
           <w:rFonts w:ascii="Garamond" w:hAnsi="Garamond"/>
           <w:color w:val="000000"/>
         </w:rPr>
-        <w:t xml:space="preserve">using the pen extension, </w:t>
+        <w:t>using the pen,</w:t>
+      </w:r>
+      <w:r>
+        <w:rPr>
+          <w:rFonts w:ascii="Garamond" w:hAnsi="Garamond"/>
+          <w:color w:val="000000"/>
+        </w:rPr>
+        <w:t xml:space="preserve"> </w:t>
       </w:r>
       <w:r>
         <w:rPr>
@@ -125,7 +351,7 @@
           <w:color w:val="000000"/>
           <w:highlight w:val="lightGray"/>
         </w:rPr>
-        <w:t>move</w:t>
+        <w:t>when clicked</w:t>
       </w:r>
       <w:r>
         <w:rPr>
@@ -147,7 +373,7 @@
           <w:color w:val="000000"/>
           <w:highlight w:val="lightGray"/>
         </w:rPr>
-        <w:t>turn</w:t>
+        <w:t>move</w:t>
       </w:r>
       <w:r>
         <w:rPr>
@@ -161,7 +387,14 @@
           <w:rFonts w:ascii="Garamond" w:hAnsi="Garamond"/>
           <w:color w:val="000000"/>
         </w:rPr>
-        <w:t xml:space="preserve"> and </w:t>
+        <w:t xml:space="preserve"> and</w:t>
+      </w:r>
+      <w:r>
+        <w:rPr>
+          <w:rFonts w:ascii="Garamond" w:hAnsi="Garamond"/>
+          <w:color w:val="000000"/>
+        </w:rPr>
+        <w:t xml:space="preserve"> </w:t>
       </w:r>
       <w:r>
         <w:rPr>
@@ -169,7 +402,14 @@
           <w:color w:val="000000"/>
           <w:highlight w:val="lightGray"/>
         </w:rPr>
-        <w:t>repeat</w:t>
+        <w:t>turn</w:t>
+      </w:r>
+      <w:r>
+        <w:rPr>
+          <w:rFonts w:ascii="Garamond" w:hAnsi="Garamond"/>
+          <w:color w:val="000000"/>
+        </w:rPr>
+        <w:t>,</w:t>
       </w:r>
       <w:r>
         <w:rPr>
@@ -221,6 +461,206 @@
         <w:t>Assignment:</w:t>
       </w:r>
     </w:p>
+    <w:p/>
+    <w:p>
+      <w:pPr>
+        <w:ind w:firstLine="540"/>
+        <w:rPr>
+          <w:rFonts w:ascii="Garamond" w:hAnsi="Garamond"/>
+        </w:rPr>
+      </w:pPr>
+      <w:r>
+        <w:t xml:space="preserve">□ </w:t>
+      </w:r>
+      <w:r>
+        <w:rPr>
+          <w:rFonts w:ascii="Garamond" w:hAnsi="Garamond"/>
+        </w:rPr>
+        <w:t xml:space="preserve">Make the program </w:t>
+      </w:r>
+      <w:r>
+        <w:rPr>
+          <w:rFonts w:ascii="Garamond" w:hAnsi="Garamond"/>
+        </w:rPr>
+        <w:t xml:space="preserve">a maze </w:t>
+      </w:r>
+      <w:r>
+        <w:rPr>
+          <w:rFonts w:ascii="Garamond" w:hAnsi="Garamond"/>
+        </w:rPr>
+        <w:t>on the background</w:t>
+      </w:r>
+    </w:p>
+    <w:p>
+      <w:pPr>
+        <w:ind w:firstLine="540"/>
+      </w:pPr>
+      <w:r>
+        <w:t xml:space="preserve">□ </w:t>
+      </w:r>
+      <w:r>
+        <w:rPr>
+          <w:rFonts w:ascii="Garamond" w:hAnsi="Garamond"/>
+        </w:rPr>
+        <w:t>Make the maze difficult so that it requires at least 8 moves and 8 turns to solve it</w:t>
+      </w:r>
+    </w:p>
+    <w:p>
+      <w:pPr>
+        <w:ind w:firstLine="540"/>
+        <w:rPr>
+          <w:rFonts w:ascii="Garamond" w:hAnsi="Garamond"/>
+        </w:rPr>
+      </w:pPr>
+      <w:r>
+        <w:t xml:space="preserve">□ </w:t>
+      </w:r>
+      <w:r>
+        <w:rPr>
+          <w:rFonts w:ascii="Garamond" w:hAnsi="Garamond"/>
+        </w:rPr>
+        <w:t>Create a program with a single “green flag clicked” start</w:t>
+      </w:r>
+    </w:p>
+    <w:p>
+      <w:pPr>
+        <w:ind w:firstLine="540"/>
+        <w:rPr>
+          <w:rFonts w:ascii="Garamond" w:hAnsi="Garamond"/>
+        </w:rPr>
+      </w:pPr>
+      <w:r>
+        <w:t xml:space="preserve">□ </w:t>
+      </w:r>
+      <w:r>
+        <w:rPr>
+          <w:rFonts w:ascii="Garamond" w:hAnsi="Garamond"/>
+        </w:rPr>
+        <w:t>Make</w:t>
+      </w:r>
+      <w:r>
+        <w:rPr>
+          <w:rFonts w:ascii="Garamond" w:hAnsi="Garamond"/>
+        </w:rPr>
+        <w:t xml:space="preserve"> the</w:t>
+      </w:r>
+      <w:r>
+        <w:rPr>
+          <w:rFonts w:ascii="Garamond" w:hAnsi="Garamond"/>
+        </w:rPr>
+        <w:t xml:space="preserve"> program </w:t>
+      </w:r>
+      <w:r>
+        <w:rPr>
+          <w:rFonts w:ascii="Garamond" w:hAnsi="Garamond"/>
+        </w:rPr>
+        <w:t xml:space="preserve">put the sprite in position when the </w:t>
+      </w:r>
+      <w:r>
+        <w:rPr>
+          <w:rFonts w:ascii="Garamond" w:hAnsi="Garamond"/>
+        </w:rPr>
+        <w:t>green flag is clicke</w:t>
+      </w:r>
+      <w:r>
+        <w:rPr>
+          <w:rFonts w:ascii="Garamond" w:hAnsi="Garamond"/>
+        </w:rPr>
+        <w:t>d</w:t>
+      </w:r>
+    </w:p>
+    <w:p>
+      <w:pPr>
+        <w:ind w:firstLine="540"/>
+        <w:rPr>
+          <w:rFonts w:ascii="Garamond" w:hAnsi="Garamond"/>
+        </w:rPr>
+      </w:pPr>
+      <w:r>
+        <w:t xml:space="preserve">□ </w:t>
+      </w:r>
+      <w:r>
+        <w:rPr>
+          <w:rFonts w:ascii="Garamond" w:hAnsi="Garamond"/>
+        </w:rPr>
+        <w:t xml:space="preserve">Make </w:t>
+      </w:r>
+      <w:r>
+        <w:rPr>
+          <w:rFonts w:ascii="Garamond" w:hAnsi="Garamond"/>
+        </w:rPr>
+        <w:t>the</w:t>
+      </w:r>
+      <w:r>
+        <w:rPr>
+          <w:rFonts w:ascii="Garamond" w:hAnsi="Garamond"/>
+        </w:rPr>
+        <w:t xml:space="preserve"> program </w:t>
+      </w:r>
+      <w:r>
+        <w:rPr>
+          <w:rFonts w:ascii="Garamond" w:hAnsi="Garamond"/>
+        </w:rPr>
+        <w:t>clear old drawn lines when the green flag is clicked</w:t>
+      </w:r>
+    </w:p>
+    <w:p>
+      <w:pPr>
+        <w:ind w:firstLine="540"/>
+        <w:rPr>
+          <w:rFonts w:ascii="Garamond" w:hAnsi="Garamond"/>
+        </w:rPr>
+      </w:pPr>
+      <w:r>
+        <w:t xml:space="preserve">□ </w:t>
+      </w:r>
+      <w:r>
+        <w:rPr>
+          <w:rFonts w:ascii="Garamond" w:hAnsi="Garamond"/>
+        </w:rPr>
+        <w:t>Create a program that solves the maze</w:t>
+      </w:r>
+      <w:r>
+        <w:rPr>
+          <w:rFonts w:ascii="Garamond" w:hAnsi="Garamond"/>
+        </w:rPr>
+        <w:t xml:space="preserve"> without any “pen ink” on the maze walls</w:t>
+      </w:r>
+    </w:p>
+    <w:p>
+      <w:pPr>
+        <w:pBdr>
+          <w:bottom w:val="double" w:sz="6" w:space="1" w:color="auto"/>
+        </w:pBdr>
+        <w:rPr>
+          <w:rFonts w:ascii="Garamond" w:hAnsi="Garamond"/>
+        </w:rPr>
+      </w:pPr>
+    </w:p>
+    <w:p>
+      <w:pPr>
+        <w:rPr>
+          <w:rFonts w:ascii="Garamond" w:hAnsi="Garamond"/>
+        </w:rPr>
+      </w:pPr>
+    </w:p>
+    <w:p>
+      <w:pPr>
+        <w:rPr>
+          <w:rFonts w:ascii="Garamond" w:hAnsi="Garamond"/>
+          <w:sz w:val="32"/>
+          <w:szCs w:val="32"/>
+        </w:rPr>
+      </w:pPr>
+      <w:r>
+        <w:rPr>
+          <w:rFonts w:ascii="Garamond" w:hAnsi="Garamond"/>
+          <w:sz w:val="32"/>
+          <w:szCs w:val="32"/>
+        </w:rPr>
+        <w:t>Bonus</w:t>
+      </w:r>
+    </w:p>
     <w:p>
       <w:pPr>
         <w:rPr>
@@ -233,7 +673,7 @@
         <w:pStyle w:val="ListParagraph"/>
         <w:numPr>
           <w:ilvl w:val="0"/>
-          <w:numId w:val="4"/>
+          <w:numId w:val="6"/>
         </w:numPr>
         <w:rPr>
           <w:rFonts w:ascii="Garamond" w:hAnsi="Garamond"/>
@@ -243,29 +683,33 @@
         <w:rPr>
           <w:rFonts w:ascii="Garamond" w:hAnsi="Garamond"/>
         </w:rPr>
-        <w:t xml:space="preserve">Make a maze </w:t>
-      </w:r>
-      <w:r>
-        <w:rPr>
-          <w:rFonts w:ascii="Garamond" w:hAnsi="Garamond"/>
-        </w:rPr>
-        <w:t xml:space="preserve">on the </w:t>
-      </w:r>
-      <w:proofErr w:type="gramStart"/>
-      <w:r>
-        <w:rPr>
-          <w:rFonts w:ascii="Garamond" w:hAnsi="Garamond"/>
-        </w:rPr>
-        <w:t>background</w:t>
-      </w:r>
-      <w:proofErr w:type="gramEnd"/>
+        <w:t xml:space="preserve">Use loops so that your </w:t>
+      </w:r>
+      <w:r>
+        <w:rPr>
+          <w:rFonts w:ascii="Garamond" w:hAnsi="Garamond"/>
+        </w:rPr>
+        <w:t>sprite</w:t>
+      </w:r>
+      <w:r>
+        <w:rPr>
+          <w:rFonts w:ascii="Garamond" w:hAnsi="Garamond"/>
+        </w:rPr>
+        <w:t xml:space="preserve"> can be seen moving slowly in a straight line</w:t>
+      </w:r>
+      <w:r>
+        <w:rPr>
+          <w:rFonts w:ascii="Garamond" w:hAnsi="Garamond"/>
+        </w:rPr>
+        <w:t xml:space="preserve"> (5pts)</w:t>
+      </w:r>
     </w:p>
     <w:p>
       <w:pPr>
         <w:pStyle w:val="ListParagraph"/>
         <w:numPr>
           <w:ilvl w:val="0"/>
-          <w:numId w:val="4"/>
+          <w:numId w:val="6"/>
         </w:numPr>
         <w:rPr>
           <w:rFonts w:ascii="Garamond" w:hAnsi="Garamond"/>
@@ -275,53 +719,57 @@
         <w:rPr>
           <w:rFonts w:ascii="Garamond" w:hAnsi="Garamond"/>
         </w:rPr>
-        <w:t xml:space="preserve">Make the maze difficult </w:t>
-      </w:r>
-      <w:r>
-        <w:rPr>
-          <w:rFonts w:ascii="Garamond" w:hAnsi="Garamond"/>
-        </w:rPr>
-        <w:t xml:space="preserve">so that it requires at least </w:t>
-      </w:r>
-      <w:r>
-        <w:rPr>
-          <w:rFonts w:ascii="Garamond" w:hAnsi="Garamond"/>
-        </w:rPr>
-        <w:t>8</w:t>
-      </w:r>
-      <w:r>
-        <w:rPr>
-          <w:rFonts w:ascii="Garamond" w:hAnsi="Garamond"/>
-        </w:rPr>
-        <w:t xml:space="preserve"> moves and </w:t>
-      </w:r>
-      <w:r>
-        <w:rPr>
-          <w:rFonts w:ascii="Garamond" w:hAnsi="Garamond"/>
-        </w:rPr>
-        <w:t>8</w:t>
-      </w:r>
-      <w:r>
-        <w:rPr>
-          <w:rFonts w:ascii="Garamond" w:hAnsi="Garamond"/>
-        </w:rPr>
-        <w:t xml:space="preserve"> turns to solve </w:t>
-      </w:r>
-      <w:proofErr w:type="gramStart"/>
-      <w:r>
-        <w:rPr>
-          <w:rFonts w:ascii="Garamond" w:hAnsi="Garamond"/>
-        </w:rPr>
-        <w:t>it</w:t>
-      </w:r>
-      <w:proofErr w:type="gramEnd"/>
+        <w:t xml:space="preserve">Use loops so that </w:t>
+      </w:r>
+      <w:r>
+        <w:rPr>
+          <w:rFonts w:ascii="Garamond" w:hAnsi="Garamond"/>
+        </w:rPr>
+        <w:t xml:space="preserve">your </w:t>
+      </w:r>
+      <w:r>
+        <w:rPr>
+          <w:rFonts w:ascii="Garamond" w:hAnsi="Garamond"/>
+        </w:rPr>
+        <w:t>sprite</w:t>
+      </w:r>
+      <w:r>
+        <w:rPr>
+          <w:rFonts w:ascii="Garamond" w:hAnsi="Garamond"/>
+        </w:rPr>
+        <w:t xml:space="preserve"> </w:t>
+      </w:r>
+      <w:r>
+        <w:rPr>
+          <w:rFonts w:ascii="Garamond" w:hAnsi="Garamond"/>
+        </w:rPr>
+        <w:t xml:space="preserve">can be seen </w:t>
+      </w:r>
+      <w:r>
+        <w:rPr>
+          <w:rFonts w:ascii="Garamond" w:hAnsi="Garamond"/>
+        </w:rPr>
+        <w:t>turning</w:t>
+      </w:r>
+      <w:r>
+        <w:rPr>
+          <w:rFonts w:ascii="Garamond" w:hAnsi="Garamond"/>
+        </w:rPr>
+        <w:t xml:space="preserve"> slowly to point in the right direction</w:t>
+      </w:r>
+      <w:r>
+        <w:rPr>
+          <w:rFonts w:ascii="Garamond" w:hAnsi="Garamond"/>
+        </w:rPr>
+        <w:t xml:space="preserve"> (5pts)</w:t>
+      </w:r>
     </w:p>
     <w:p>
       <w:pPr>
         <w:pStyle w:val="ListParagraph"/>
         <w:numPr>
           <w:ilvl w:val="0"/>
-          <w:numId w:val="4"/>
+          <w:numId w:val="6"/>
         </w:numPr>
         <w:rPr>
           <w:rFonts w:ascii="Garamond" w:hAnsi="Garamond"/>
@@ -331,304 +779,77 @@
         <w:rPr>
           <w:rFonts w:ascii="Garamond" w:hAnsi="Garamond"/>
         </w:rPr>
-        <w:t xml:space="preserve">Create a program with a single “green flag clicked” </w:t>
-      </w:r>
-      <w:proofErr w:type="gramStart"/>
-      <w:r>
-        <w:rPr>
-          <w:rFonts w:ascii="Garamond" w:hAnsi="Garamond"/>
-        </w:rPr>
-        <w:t>start</w:t>
-      </w:r>
-      <w:proofErr w:type="gramEnd"/>
-    </w:p>
-    <w:p>
-      <w:pPr>
-        <w:pStyle w:val="ListParagraph"/>
-        <w:numPr>
-          <w:ilvl w:val="0"/>
-          <w:numId w:val="4"/>
-        </w:numPr>
-        <w:rPr>
-          <w:rFonts w:ascii="Garamond" w:hAnsi="Garamond"/>
-        </w:rPr>
-      </w:pPr>
-      <w:r>
-        <w:rPr>
-          <w:rFonts w:ascii="Garamond" w:hAnsi="Garamond"/>
-        </w:rPr>
-        <w:t>Make</w:t>
-      </w:r>
-      <w:r>
-        <w:rPr>
-          <w:rFonts w:ascii="Garamond" w:hAnsi="Garamond"/>
-        </w:rPr>
-        <w:t xml:space="preserve"> the</w:t>
-      </w:r>
-      <w:r>
-        <w:rPr>
-          <w:rFonts w:ascii="Garamond" w:hAnsi="Garamond"/>
-        </w:rPr>
-        <w:t xml:space="preserve"> program </w:t>
-      </w:r>
-      <w:r>
-        <w:rPr>
-          <w:rFonts w:ascii="Garamond" w:hAnsi="Garamond"/>
-        </w:rPr>
-        <w:t xml:space="preserve">put the </w:t>
-      </w:r>
-      <w:r>
-        <w:rPr>
-          <w:rFonts w:ascii="Garamond" w:hAnsi="Garamond"/>
-        </w:rPr>
-        <w:t>sprite</w:t>
-      </w:r>
-      <w:r>
-        <w:rPr>
-          <w:rFonts w:ascii="Garamond" w:hAnsi="Garamond"/>
-        </w:rPr>
-        <w:t xml:space="preserve"> in position</w:t>
-      </w:r>
-      <w:r>
-        <w:rPr>
-          <w:rFonts w:ascii="Garamond" w:hAnsi="Garamond"/>
-        </w:rPr>
-        <w:t xml:space="preserve"> </w:t>
-      </w:r>
-      <w:r>
-        <w:rPr>
-          <w:rFonts w:ascii="Garamond" w:hAnsi="Garamond"/>
-        </w:rPr>
-        <w:t xml:space="preserve">when the </w:t>
-      </w:r>
-      <w:r>
-        <w:rPr>
-          <w:rFonts w:ascii="Garamond" w:hAnsi="Garamond"/>
-        </w:rPr>
-        <w:t xml:space="preserve">green flag is </w:t>
-      </w:r>
-      <w:proofErr w:type="gramStart"/>
-      <w:r>
-        <w:rPr>
-          <w:rFonts w:ascii="Garamond" w:hAnsi="Garamond"/>
-        </w:rPr>
-        <w:t>clicked</w:t>
-      </w:r>
-      <w:proofErr w:type="gramEnd"/>
-    </w:p>
-    <w:p>
-      <w:pPr>
-        <w:pStyle w:val="ListParagraph"/>
-        <w:numPr>
-          <w:ilvl w:val="0"/>
-          <w:numId w:val="4"/>
-        </w:numPr>
-        <w:rPr>
-          <w:rFonts w:ascii="Garamond" w:hAnsi="Garamond"/>
-        </w:rPr>
-      </w:pPr>
-      <w:r>
-        <w:rPr>
-          <w:rFonts w:ascii="Garamond" w:hAnsi="Garamond"/>
-        </w:rPr>
-        <w:t xml:space="preserve">Make </w:t>
-      </w:r>
-      <w:r>
-        <w:rPr>
-          <w:rFonts w:ascii="Garamond" w:hAnsi="Garamond"/>
-        </w:rPr>
-        <w:t>the</w:t>
-      </w:r>
-      <w:r>
-        <w:rPr>
-          <w:rFonts w:ascii="Garamond" w:hAnsi="Garamond"/>
-        </w:rPr>
-        <w:t xml:space="preserve"> program </w:t>
-      </w:r>
-      <w:r>
-        <w:rPr>
-          <w:rFonts w:ascii="Garamond" w:hAnsi="Garamond"/>
-        </w:rPr>
-        <w:t xml:space="preserve">clear old drawn lines when the green flag is </w:t>
-      </w:r>
-      <w:proofErr w:type="gramStart"/>
-      <w:r>
-        <w:rPr>
-          <w:rFonts w:ascii="Garamond" w:hAnsi="Garamond"/>
-        </w:rPr>
-        <w:t>clicked</w:t>
-      </w:r>
-      <w:proofErr w:type="gramEnd"/>
-    </w:p>
-    <w:p>
-      <w:pPr>
-        <w:pStyle w:val="ListParagraph"/>
-        <w:numPr>
-          <w:ilvl w:val="0"/>
-          <w:numId w:val="4"/>
-        </w:numPr>
-        <w:rPr>
-          <w:rFonts w:ascii="Garamond" w:hAnsi="Garamond"/>
-        </w:rPr>
-      </w:pPr>
-      <w:r>
-        <w:rPr>
-          <w:rFonts w:ascii="Garamond" w:hAnsi="Garamond"/>
-        </w:rPr>
-        <w:t>Create a program that solves the maze</w:t>
-      </w:r>
-      <w:r>
-        <w:rPr>
-          <w:rFonts w:ascii="Garamond" w:hAnsi="Garamond"/>
-        </w:rPr>
-        <w:t xml:space="preserve"> without any “pen ink” on the maze walls</w:t>
-      </w:r>
-    </w:p>
-    <w:p>
-      <w:pPr>
-        <w:pBdr>
-          <w:bottom w:val="double" w:sz="6" w:space="1" w:color="auto"/>
-        </w:pBdr>
-        <w:rPr>
-          <w:rFonts w:ascii="Garamond" w:hAnsi="Garamond"/>
-        </w:rPr>
-      </w:pPr>
-    </w:p>
-    <w:p>
-      <w:pPr>
-        <w:rPr>
-          <w:rFonts w:ascii="Garamond" w:hAnsi="Garamond"/>
-        </w:rPr>
-      </w:pPr>
-    </w:p>
-    <w:p>
-      <w:pPr>
-        <w:rPr>
-          <w:rFonts w:ascii="Garamond" w:hAnsi="Garamond"/>
-          <w:sz w:val="32"/>
-          <w:szCs w:val="32"/>
-        </w:rPr>
-      </w:pPr>
-      <w:r>
-        <w:rPr>
-          <w:rFonts w:ascii="Garamond" w:hAnsi="Garamond"/>
-          <w:sz w:val="32"/>
-          <w:szCs w:val="32"/>
-        </w:rPr>
-        <w:t>Bonus</w:t>
-      </w:r>
-      <w:r>
-        <w:rPr>
-          <w:rFonts w:ascii="Garamond" w:hAnsi="Garamond"/>
-          <w:sz w:val="32"/>
-          <w:szCs w:val="32"/>
-        </w:rPr>
-        <w:t>:</w:t>
-      </w:r>
-    </w:p>
-    <w:p>
-      <w:pPr>
-        <w:rPr>
-          <w:rFonts w:ascii="Garamond" w:hAnsi="Garamond"/>
-        </w:rPr>
-      </w:pPr>
-    </w:p>
-    <w:p>
-      <w:pPr>
-        <w:pStyle w:val="ListParagraph"/>
-        <w:numPr>
-          <w:ilvl w:val="0"/>
-          <w:numId w:val="4"/>
-        </w:numPr>
-        <w:rPr>
-          <w:rFonts w:ascii="Garamond" w:hAnsi="Garamond"/>
-        </w:rPr>
-      </w:pPr>
-      <w:r>
-        <w:rPr>
-          <w:rFonts w:ascii="Garamond" w:hAnsi="Garamond"/>
-        </w:rPr>
-        <w:t xml:space="preserve">Use loops so that your character can be seen moving slowly in a straight </w:t>
-      </w:r>
-      <w:proofErr w:type="gramStart"/>
-      <w:r>
-        <w:rPr>
-          <w:rFonts w:ascii="Garamond" w:hAnsi="Garamond"/>
-        </w:rPr>
-        <w:t>line</w:t>
-      </w:r>
-      <w:proofErr w:type="gramEnd"/>
-    </w:p>
-    <w:p>
-      <w:pPr>
-        <w:pStyle w:val="ListParagraph"/>
-        <w:numPr>
-          <w:ilvl w:val="0"/>
-          <w:numId w:val="4"/>
-        </w:numPr>
-        <w:rPr>
-          <w:rFonts w:ascii="Garamond" w:hAnsi="Garamond"/>
-        </w:rPr>
-      </w:pPr>
-      <w:r>
-        <w:rPr>
-          <w:rFonts w:ascii="Garamond" w:hAnsi="Garamond"/>
-        </w:rPr>
-        <w:t xml:space="preserve">Use loops so that </w:t>
-      </w:r>
-      <w:r>
-        <w:rPr>
-          <w:rFonts w:ascii="Garamond" w:hAnsi="Garamond"/>
-        </w:rPr>
-        <w:t xml:space="preserve">your character </w:t>
-      </w:r>
-      <w:r>
-        <w:rPr>
-          <w:rFonts w:ascii="Garamond" w:hAnsi="Garamond"/>
-        </w:rPr>
-        <w:t xml:space="preserve">can be seen spinning slowly to point in the right </w:t>
-      </w:r>
-      <w:proofErr w:type="gramStart"/>
-      <w:r>
-        <w:rPr>
-          <w:rFonts w:ascii="Garamond" w:hAnsi="Garamond"/>
-        </w:rPr>
-        <w:t>direction</w:t>
-      </w:r>
-      <w:proofErr w:type="gramEnd"/>
-    </w:p>
-    <w:p>
-      <w:pPr>
-        <w:pStyle w:val="ListParagraph"/>
-        <w:numPr>
-          <w:ilvl w:val="0"/>
-          <w:numId w:val="4"/>
-        </w:numPr>
-        <w:rPr>
-          <w:rFonts w:ascii="Garamond" w:hAnsi="Garamond"/>
-        </w:rPr>
-      </w:pPr>
-      <w:r>
-        <w:rPr>
-          <w:rFonts w:ascii="Garamond" w:hAnsi="Garamond"/>
-        </w:rPr>
-        <w:t xml:space="preserve">Add a second level to your </w:t>
-      </w:r>
-      <w:proofErr w:type="gramStart"/>
-      <w:r>
-        <w:rPr>
-          <w:rFonts w:ascii="Garamond" w:hAnsi="Garamond"/>
-        </w:rPr>
-        <w:t>maze</w:t>
-      </w:r>
-      <w:proofErr w:type="gramEnd"/>
-    </w:p>
-    <w:p>
-      <w:pPr>
-        <w:rPr>
-          <w:rFonts w:ascii="Garamond" w:hAnsi="Garamond"/>
-        </w:rPr>
-      </w:pPr>
+        <w:t>Add a second level to your maze</w:t>
+      </w:r>
+      <w:r>
+        <w:rPr>
+          <w:rFonts w:ascii="Garamond" w:hAnsi="Garamond"/>
+        </w:rPr>
+        <w:t xml:space="preserve"> (5pts)</w:t>
+      </w:r>
+    </w:p>
+    <w:p>
+      <w:pPr>
+        <w:rPr>
+          <w:rFonts w:ascii="Garamond" w:hAnsi="Garamond"/>
+        </w:rPr>
+      </w:pPr>
+    </w:p>
+    <w:p>
+      <w:pPr>
+        <w:ind w:left="720"/>
+        <w:jc w:val="center"/>
+        <w:rPr>
+          <w:rFonts w:ascii="Garamond" w:hAnsi="Garamond"/>
+        </w:rPr>
+      </w:pPr>
+      <w:r>
+        <w:rPr>
+          <w:rFonts w:ascii="Garamond" w:hAnsi="Garamond"/>
+          <w:noProof/>
+        </w:rPr>
+        <w:drawing>
+          <wp:inline distT="0" distB="0" distL="0" distR="0" wp14:anchorId="707C256B" wp14:editId="18F22B15">
+            <wp:extent cx="3151414" cy="584157"/>
+            <wp:effectExtent l="0" t="0" r="0" b="635"/>
+            <wp:docPr id="71500285" name="Picture 5" descr="A white oval with black numbers&#10;&#10;AI-generated content may be incorrect."/>
+            <wp:cNvGraphicFramePr>
+              <a:graphicFrameLocks xmlns:a="http://schemas.openxmlformats.org/drawingml/2006/main" noChangeAspect="1"/>
+            </wp:cNvGraphicFramePr>
+            <a:graphic xmlns:a="http://schemas.openxmlformats.org/drawingml/2006/main">
+              <a:graphicData uri="http://schemas.openxmlformats.org/drawingml/2006/picture">
+                <pic:pic xmlns:pic="http://schemas.openxmlformats.org/drawingml/2006/picture">
+                  <pic:nvPicPr>
+                    <pic:cNvPr id="71500285" name="Picture 5" descr="A white oval with black numbers&#10;&#10;AI-generated content may be incorrect."/>
+                    <pic:cNvPicPr/>
+                  </pic:nvPicPr>
+                  <pic:blipFill>
+                    <a:blip r:embed="rId8">
+                      <a:extLst>
+                        <a:ext uri="{28A0092B-C50C-407E-A947-70E740481C1C}">
+                          <a14:useLocalDpi xmlns:a14="http://schemas.microsoft.com/office/drawing/2010/main" val="0"/>
+                        </a:ext>
+                      </a:extLst>
+                    </a:blip>
+                    <a:stretch>
+                      <a:fillRect/>
+                    </a:stretch>
+                  </pic:blipFill>
+                  <pic:spPr>
+                    <a:xfrm>
+                      <a:off x="0" y="0"/>
+                      <a:ext cx="3277311" cy="607494"/>
+                    </a:xfrm>
+                    <a:prstGeom prst="rect">
+                      <a:avLst/>
+                    </a:prstGeom>
+                  </pic:spPr>
+                </pic:pic>
+              </a:graphicData>
+            </a:graphic>
+          </wp:inline>
+        </w:drawing>
+      </w:r>
     </w:p>
     <w:sectPr>
       <w:pgSz w:w="12240" w:h="15840"/>
@@ -641,7 +862,7 @@
 </file>
 
 <file path=word/numbering.xml><?xml version="1.0" encoding="utf-8"?>
-<w:numbering xmlns:wpc="http://schemas.microsoft.com/office/word/2010/wordprocessingCanvas" xmlns:cx="http://schemas.microsoft.com/office/drawing/2014/chartex" xmlns:cx1="http://schemas.microsoft.com/office/drawing/2015/9/8/chartex" xmlns:cx2="http://schemas.microsoft.com/office/drawing/2015/10/21/chartex" xmlns:cx3="http://schemas.microsoft.com/office/drawing/2016/5/9/chartex" xmlns:cx4="http://schemas.microsoft.com/office/drawing/2016/5/10/chartex" xmlns:cx5="http://schemas.microsoft.com/office/drawing/2016/5/11/chartex" xmlns:cx6="http://schemas.microsoft.com/office/drawing/2016/5/12/chartex" xmlns:cx7="http://schemas.microsoft.com/office/drawing/2016/5/13/chartex" xmlns:cx8="http://schemas.microsoft.com/office/drawing/2016/5/14/chartex" xmlns:mc="http://schemas.openxmlformats.org/markup-compatibility/2006" xmlns:aink="http://schemas.microsoft.com/office/drawing/2016/ink" xmlns:am3d="http://schemas.microsoft.com/office/drawing/2017/model3d" xmlns:o="urn:schemas-microsoft-com:office:office" xmlns:oel="http://schemas.microsoft.com/office/2019/extlst" xmlns:r="http://schemas.openxmlformats.org/officeDocument/2006/relationships" xmlns:m="http://schemas.openxmlformats.org/officeDocument/2006/math" xmlns:v="urn:schemas-microsoft-com:vml" xmlns:wp14="http://schemas.microsoft.com/office/word/2010/wordprocessingDrawing" xmlns:wp="http://schemas.openxmlformats.org/drawingml/2006/wordprocessingDrawing" xmlns:w10="urn:schemas-microsoft-com:office:word" xmlns:w="http://schemas.openxmlformats.org/wordprocessingml/2006/main" xmlns:w14="http://schemas.microsoft.com/office/word/2010/wordml" xmlns:w15="http://schemas.microsoft.com/office/word/2012/wordml" xmlns:w16cex="http://schemas.microsoft.com/office/word/2018/wordml/cex" xmlns:w16cid="http://schemas.microsoft.com/office/word/2016/wordml/cid" xmlns:w16="http://schemas.microsoft.com/office/word/2018/wordml" xmlns:w16sdtdh="http://schemas.microsoft.com/office/word/2020/wordml/sdtdatahash" xmlns:w16se="http://schemas.microsoft.com/office/word/2015/wordml/symex" xmlns:wpg="http://schemas.microsoft.com/office/word/2010/wordprocessingGroup" xmlns:wpi="http://schemas.microsoft.com/office/word/2010/wordprocessingInk" xmlns:wne="http://schemas.microsoft.com/office/word/2006/wordml" xmlns:wps="http://schemas.microsoft.com/office/word/2010/wordprocessingShape" mc:Ignorable="w14 w15 w16se w16cid w16 w16cex w16sdtdh wp14">
+<w:numbering xmlns:wpc="http://schemas.microsoft.com/office/word/2010/wordprocessingCanvas" xmlns:cx="http://schemas.microsoft.com/office/drawing/2014/chartex" xmlns:cx1="http://schemas.microsoft.com/office/drawing/2015/9/8/chartex" xmlns:cx2="http://schemas.microsoft.com/office/drawing/2015/10/21/chartex" xmlns:cx3="http://schemas.microsoft.com/office/drawing/2016/5/9/chartex" xmlns:cx4="http://schemas.microsoft.com/office/drawing/2016/5/10/chartex" xmlns:cx5="http://schemas.microsoft.com/office/drawing/2016/5/11/chartex" xmlns:cx6="http://schemas.microsoft.com/office/drawing/2016/5/12/chartex" xmlns:cx7="http://schemas.microsoft.com/office/drawing/2016/5/13/chartex" xmlns:cx8="http://schemas.microsoft.com/office/drawing/2016/5/14/chartex" xmlns:mc="http://schemas.openxmlformats.org/markup-compatibility/2006" xmlns:aink="http://schemas.microsoft.com/office/drawing/2016/ink" xmlns:am3d="http://schemas.microsoft.com/office/drawing/2017/model3d" xmlns:o="urn:schemas-microsoft-com:office:office" xmlns:oel="http://schemas.microsoft.com/office/2019/extlst" xmlns:r="http://schemas.openxmlformats.org/officeDocument/2006/relationships" xmlns:m="http://schemas.openxmlformats.org/officeDocument/2006/math" xmlns:v="urn:schemas-microsoft-com:vml" xmlns:wp14="http://schemas.microsoft.com/office/word/2010/wordprocessingDrawing" xmlns:wp="http://schemas.openxmlformats.org/drawingml/2006/wordprocessingDrawing" xmlns:w10="urn:schemas-microsoft-com:office:word" xmlns:w="http://schemas.openxmlformats.org/wordprocessingml/2006/main" xmlns:w14="http://schemas.microsoft.com/office/word/2010/wordml" xmlns:w15="http://schemas.microsoft.com/office/word/2012/wordml" xmlns:w16cex="http://schemas.microsoft.com/office/word/2018/wordml/cex" xmlns:w16cid="http://schemas.microsoft.com/office/word/2016/wordml/cid" xmlns:w16="http://schemas.microsoft.com/office/word/2018/wordml" xmlns:w16du="http://schemas.microsoft.com/office/word/2023/wordml/word16du" xmlns:w16sdtdh="http://schemas.microsoft.com/office/word/2020/wordml/sdtdatahash" xmlns:w16sdtfl="http://schemas.microsoft.com/office/word/2024/wordml/sdtformatlock" xmlns:w16se="http://schemas.microsoft.com/office/word/2015/wordml/symex" xmlns:wpg="http://schemas.microsoft.com/office/word/2010/wordprocessingGroup" xmlns:wpi="http://schemas.microsoft.com/office/word/2010/wordprocessingInk" xmlns:wne="http://schemas.microsoft.com/office/word/2006/wordml" xmlns:wps="http://schemas.microsoft.com/office/word/2010/wordprocessingShape" mc:Ignorable="w14 w15 w16se w16cid w16 w16cex w16sdtdh w16sdtfl w16du wp14">
   <w:abstractNum w:abstractNumId="0" w15:restartNumberingAfterBreak="0">
     <w:nsid w:val="0AE702BA"/>
     <w:multiLevelType w:val="hybridMultilevel"/>
@@ -756,6 +977,95 @@
     </w:lvl>
   </w:abstractNum>
   <w:abstractNum w:abstractNumId="1" w15:restartNumberingAfterBreak="0">
+    <w:nsid w:val="275356F4"/>
+    <w:multiLevelType w:val="hybridMultilevel"/>
+    <w:tmpl w:val="F56A8540"/>
+    <w:lvl w:ilvl="0" w:tplc="D3BA377C">
+      <w:start w:val="1"/>
+      <w:numFmt w:val="decimal"/>
+      <w:lvlText w:val="%1."/>
+      <w:lvlJc w:val="left"/>
+      <w:pPr>
+        <w:ind w:left="1080" w:hanging="360"/>
+      </w:pPr>
+      <w:rPr>
+        <w:rFonts w:hint="default"/>
+      </w:rPr>
+    </w:lvl>
+    <w:lvl w:ilvl="1" w:tplc="04090019" w:tentative="1">
+      <w:start w:val="1"/>
+      <w:numFmt w:val="lowerLetter"/>
+      <w:lvlText w:val="%2."/>
+      <w:lvlJc w:val="left"/>
+      <w:pPr>
+        <w:ind w:left="1800" w:hanging="360"/>
+      </w:pPr>
+    </w:lvl>
+    <w:lvl w:ilvl="2" w:tplc="0409001B" w:tentative="1">
+      <w:start w:val="1"/>
+      <w:numFmt w:val="lowerRoman"/>
+      <w:lvlText w:val="%3."/>
+      <w:lvlJc w:val="right"/>
+      <w:pPr>
+        <w:ind w:left="2520" w:hanging="180"/>
+      </w:pPr>
+    </w:lvl>
+    <w:lvl w:ilvl="3" w:tplc="0409000F" w:tentative="1">
+      <w:start w:val="1"/>
+      <w:numFmt w:val="decimal"/>
+      <w:lvlText w:val="%4."/>
+      <w:lvlJc w:val="left"/>
+      <w:pPr>
+        <w:ind w:left="3240" w:hanging="360"/>
+      </w:pPr>
+    </w:lvl>
+    <w:lvl w:ilvl="4" w:tplc="04090019" w:tentative="1">
+      <w:start w:val="1"/>
+      <w:numFmt w:val="lowerLetter"/>
+      <w:lvlText w:val="%5."/>
+      <w:lvlJc w:val="left"/>
+      <w:pPr>
+        <w:ind w:left="3960" w:hanging="360"/>
+      </w:pPr>
+    </w:lvl>
+    <w:lvl w:ilvl="5" w:tplc="0409001B" w:tentative="1">
+      <w:start w:val="1"/>
+      <w:numFmt w:val="lowerRoman"/>
+      <w:lvlText w:val="%6."/>
+      <w:lvlJc w:val="right"/>
+      <w:pPr>
+        <w:ind w:left="4680" w:hanging="180"/>
+      </w:pPr>
+    </w:lvl>
+    <w:lvl w:ilvl="6" w:tplc="0409000F" w:tentative="1">
+      <w:start w:val="1"/>
+      <w:numFmt w:val="decimal"/>
+      <w:lvlText w:val="%7."/>
+      <w:lvlJc w:val="left"/>
+      <w:pPr>
+        <w:ind w:left="5400" w:hanging="360"/>
+      </w:pPr>
+    </w:lvl>
+    <w:lvl w:ilvl="7" w:tplc="04090019" w:tentative="1">
+      <w:start w:val="1"/>
+      <w:numFmt w:val="lowerLetter"/>
+      <w:lvlText w:val="%8."/>
+      <w:lvlJc w:val="left"/>
+      <w:pPr>
+        <w:ind w:left="6120" w:hanging="360"/>
+      </w:pPr>
+    </w:lvl>
+    <w:lvl w:ilvl="8" w:tplc="0409001B" w:tentative="1">
+      <w:start w:val="1"/>
+      <w:numFmt w:val="lowerRoman"/>
+      <w:lvlText w:val="%9."/>
+      <w:lvlJc w:val="right"/>
+      <w:pPr>
+        <w:ind w:left="6840" w:hanging="180"/>
+      </w:pPr>
+    </w:lvl>
+  </w:abstractNum>
+  <w:abstractNum w:abstractNumId="2" w15:restartNumberingAfterBreak="0">
     <w:nsid w:val="36A93F0C"/>
     <w:multiLevelType w:val="hybridMultilevel"/>
     <w:tmpl w:val="A5ECDD94"/>
@@ -868,7 +1178,96 @@
       </w:rPr>
     </w:lvl>
   </w:abstractNum>
-  <w:abstractNum w:abstractNumId="2" w15:restartNumberingAfterBreak="0">
+  <w:abstractNum w:abstractNumId="3" w15:restartNumberingAfterBreak="0">
+    <w:nsid w:val="51253396"/>
+    <w:multiLevelType w:val="hybridMultilevel"/>
+    <w:tmpl w:val="ECEA7DDA"/>
+    <w:lvl w:ilvl="0" w:tplc="0409000F">
+      <w:start w:val="1"/>
+      <w:numFmt w:val="decimal"/>
+      <w:lvlText w:val="%1."/>
+      <w:lvlJc w:val="left"/>
+      <w:pPr>
+        <w:ind w:left="720" w:hanging="360"/>
+      </w:pPr>
+      <w:rPr>
+        <w:rFonts w:hint="default"/>
+      </w:rPr>
+    </w:lvl>
+    <w:lvl w:ilvl="1" w:tplc="04090019" w:tentative="1">
+      <w:start w:val="1"/>
+      <w:numFmt w:val="lowerLetter"/>
+      <w:lvlText w:val="%2."/>
+      <w:lvlJc w:val="left"/>
+      <w:pPr>
+        <w:ind w:left="1440" w:hanging="360"/>
+      </w:pPr>
+    </w:lvl>
+    <w:lvl w:ilvl="2" w:tplc="0409001B" w:tentative="1">
+      <w:start w:val="1"/>
+      <w:numFmt w:val="lowerRoman"/>
+      <w:lvlText w:val="%3."/>
+      <w:lvlJc w:val="right"/>
+      <w:pPr>
+        <w:ind w:left="2160" w:hanging="180"/>
+      </w:pPr>
+    </w:lvl>
+    <w:lvl w:ilvl="3" w:tplc="0409000F" w:tentative="1">
+      <w:start w:val="1"/>
+      <w:numFmt w:val="decimal"/>
+      <w:lvlText w:val="%4."/>
+      <w:lvlJc w:val="left"/>
+      <w:pPr>
+        <w:ind w:left="2880" w:hanging="360"/>
+      </w:pPr>
+    </w:lvl>
+    <w:lvl w:ilvl="4" w:tplc="04090019" w:tentative="1">
+      <w:start w:val="1"/>
+      <w:numFmt w:val="lowerLetter"/>
+      <w:lvlText w:val="%5."/>
+      <w:lvlJc w:val="left"/>
+      <w:pPr>
+        <w:ind w:left="3600" w:hanging="360"/>
+      </w:pPr>
+    </w:lvl>
+    <w:lvl w:ilvl="5" w:tplc="0409001B" w:tentative="1">
+      <w:start w:val="1"/>
+      <w:numFmt w:val="lowerRoman"/>
+      <w:lvlText w:val="%6."/>
+      <w:lvlJc w:val="right"/>
+      <w:pPr>
+        <w:ind w:left="4320" w:hanging="180"/>
+      </w:pPr>
+    </w:lvl>
+    <w:lvl w:ilvl="6" w:tplc="0409000F" w:tentative="1">
+      <w:start w:val="1"/>
+      <w:numFmt w:val="decimal"/>
+      <w:lvlText w:val="%7."/>
+      <w:lvlJc w:val="left"/>
+      <w:pPr>
+        <w:ind w:left="5040" w:hanging="360"/>
+      </w:pPr>
+    </w:lvl>
+    <w:lvl w:ilvl="7" w:tplc="04090019" w:tentative="1">
+      <w:start w:val="1"/>
+      <w:numFmt w:val="lowerLetter"/>
+      <w:lvlText w:val="%8."/>
+      <w:lvlJc w:val="left"/>
+      <w:pPr>
+        <w:ind w:left="5760" w:hanging="360"/>
+      </w:pPr>
+    </w:lvl>
+    <w:lvl w:ilvl="8" w:tplc="0409001B" w:tentative="1">
+      <w:start w:val="1"/>
+      <w:numFmt w:val="lowerRoman"/>
+      <w:lvlText w:val="%9."/>
+      <w:lvlJc w:val="right"/>
+      <w:pPr>
+        <w:ind w:left="6480" w:hanging="180"/>
+      </w:pPr>
+    </w:lvl>
+  </w:abstractNum>
+  <w:abstractNum w:abstractNumId="4" w15:restartNumberingAfterBreak="0">
     <w:nsid w:val="5D0A7F9B"/>
     <w:multiLevelType w:val="hybridMultilevel"/>
     <w:tmpl w:val="3F6C6E58"/>
@@ -981,7 +1380,7 @@
       </w:rPr>
     </w:lvl>
   </w:abstractNum>
-  <w:abstractNum w:abstractNumId="3" w15:restartNumberingAfterBreak="0">
+  <w:abstractNum w:abstractNumId="5" w15:restartNumberingAfterBreak="0">
     <w:nsid w:val="7356751F"/>
     <w:multiLevelType w:val="hybridMultilevel"/>
     <w:tmpl w:val="A2FE5386"/>
@@ -1071,22 +1470,28 @@
     </w:lvl>
   </w:abstractNum>
   <w:num w:numId="1" w16cid:durableId="628559858">
-    <w:abstractNumId w:val="1"/>
+    <w:abstractNumId w:val="2"/>
   </w:num>
   <w:num w:numId="2" w16cid:durableId="2026245091">
-    <w:abstractNumId w:val="3"/>
+    <w:abstractNumId w:val="5"/>
   </w:num>
   <w:num w:numId="3" w16cid:durableId="1849245770">
     <w:abstractNumId w:val="0"/>
   </w:num>
   <w:num w:numId="4" w16cid:durableId="1999993005">
-    <w:abstractNumId w:val="2"/>
+    <w:abstractNumId w:val="4"/>
+  </w:num>
+  <w:num w:numId="5" w16cid:durableId="570966713">
+    <w:abstractNumId w:val="1"/>
+  </w:num>
+  <w:num w:numId="6" w16cid:durableId="1078942111">
+    <w:abstractNumId w:val="3"/>
   </w:num>
 </w:numbering>
 </file>
 
 <file path=word/styles.xml><?xml version="1.0" encoding="utf-8"?>
-<w:styles xmlns:mc="http://schemas.openxmlformats.org/markup-compatibility/2006" xmlns:r="http://schemas.openxmlformats.org/officeDocument/2006/relationships" xmlns:w="http://schemas.openxmlformats.org/wordprocessingml/2006/main" xmlns:w14="http://schemas.microsoft.com/office/word/2010/wordml" xmlns:w15="http://schemas.microsoft.com/office/word/2012/wordml" xmlns:w16cex="http://schemas.microsoft.com/office/word/2018/wordml/cex" xmlns:w16cid="http://schemas.microsoft.com/office/word/2016/wordml/cid" xmlns:w16="http://schemas.microsoft.com/office/word/2018/wordml" xmlns:w16sdtdh="http://schemas.microsoft.com/office/word/2020/wordml/sdtdatahash" xmlns:w16se="http://schemas.microsoft.com/office/word/2015/wordml/symex" mc:Ignorable="w14 w15 w16se w16cid w16 w16cex w16sdtdh">
+<w:styles xmlns:mc="http://schemas.openxmlformats.org/markup-compatibility/2006" xmlns:r="http://schemas.openxmlformats.org/officeDocument/2006/relationships" xmlns:w="http://schemas.openxmlformats.org/wordprocessingml/2006/main" xmlns:w14="http://schemas.microsoft.com/office/word/2010/wordml" xmlns:w15="http://schemas.microsoft.com/office/word/2012/wordml" xmlns:w16cex="http://schemas.microsoft.com/office/word/2018/wordml/cex" xmlns:w16cid="http://schemas.microsoft.com/office/word/2016/wordml/cid" xmlns:w16="http://schemas.microsoft.com/office/word/2018/wordml" xmlns:w16du="http://schemas.microsoft.com/office/word/2023/wordml/word16du" xmlns:w16sdtdh="http://schemas.microsoft.com/office/word/2020/wordml/sdtdatahash" xmlns:w16sdtfl="http://schemas.microsoft.com/office/word/2024/wordml/sdtformatlock" xmlns:w16se="http://schemas.microsoft.com/office/word/2015/wordml/symex" mc:Ignorable="w14 w15 w16se w16cid w16 w16cex w16sdtdh w16sdtfl w16du">
   <w:docDefaults>
     <w:rPrDefault>
       <w:rPr>

</xml_diff>